<commit_message>
docs(canvas): completar Machine Learning Canvas v1.2 con la implementación de MiBici P2
</commit_message>
<xml_diff>
--- a/MLOps_Equipo30/docs/docs/Machine Learning Canvas (v1.2).docx
+++ b/MLOps_Equipo30/docs/docs/Machine Learning Canvas (v1.2).docx
@@ -90,15 +90,15 @@
       <w:r>
         <w:rPr>
           <w:rFonts w:ascii="IBM Plex Sans" w:cs="IBM Plex Sans" w:eastAsia="IBM Plex Sans" w:hAnsi="IBM Plex Sans"/>
-          <w:b w:val="0"/>
+          <w:b/>
           <w:bCs w:val="0"/>
-          <w:color w:val="999999"/>
-          <w:sz w:val="14"/>
+          <w:color w:val="020094"/>
+          <w:sz w:val="15"/>
           <w:szCs w:val="14"/>
           <w:highlight w:val="white"/>
           <w:rtl w:val="0"/>
         </w:rPr>
-        <w:t xml:space="preserve">                                          </w:t>
+        <w:t xml:space="preserve"> MiBici Guadalajara (AMIM / IMEPLAN) </w:t>
       </w:r>
       <w:r>
         <w:rPr>
@@ -138,15 +138,15 @@
       <w:r>
         <w:rPr>
           <w:rFonts w:ascii="IBM Plex Sans" w:cs="IBM Plex Sans" w:eastAsia="IBM Plex Sans" w:hAnsi="IBM Plex Sans"/>
-          <w:b w:val="0"/>
+          <w:b/>
           <w:bCs w:val="0"/>
-          <w:color w:val="999999"/>
-          <w:sz w:val="14"/>
+          <w:color w:val="020094"/>
+          <w:sz w:val="15"/>
           <w:szCs w:val="14"/>
           <w:highlight w:val="white"/>
           <w:rtl w:val="0"/>
         </w:rPr>
-        <w:t xml:space="preserve">                                </w:t>
+        <w:t xml:space="preserve"> Equipo 30 - TC5061 </w:t>
       </w:r>
       <w:r>
         <w:rPr>
@@ -163,15 +163,15 @@
       <w:r>
         <w:rPr>
           <w:rFonts w:ascii="IBM Plex Sans" w:cs="IBM Plex Sans" w:eastAsia="IBM Plex Sans" w:hAnsi="IBM Plex Sans"/>
-          <w:b w:val="0"/>
+          <w:b/>
           <w:bCs w:val="0"/>
-          <w:color w:val="999999"/>
-          <w:sz w:val="14"/>
+          <w:color w:val="020094"/>
+          <w:sz w:val="15"/>
           <w:szCs w:val="14"/>
           <w:highlight w:val="white"/>
           <w:rtl w:val="0"/>
         </w:rPr>
-        <w:t xml:space="preserve">                              </w:t>
+        <w:t xml:space="preserve"> Octubre 2026 </w:t>
       </w:r>
       <w:r>
         <w:rPr>
@@ -188,15 +188,15 @@
       <w:r>
         <w:rPr>
           <w:rFonts w:ascii="IBM Plex Sans" w:cs="IBM Plex Sans" w:eastAsia="IBM Plex Sans" w:hAnsi="IBM Plex Sans"/>
-          <w:b w:val="0"/>
+          <w:b/>
           <w:bCs w:val="0"/>
-          <w:color w:val="999999"/>
-          <w:sz w:val="14"/>
+          <w:color w:val="020094"/>
+          <w:sz w:val="15"/>
           <w:szCs w:val="14"/>
           <w:highlight w:val="white"/>
           <w:rtl w:val="0"/>
         </w:rPr>
-        <w:t xml:space="preserve">        .</w:t>
+        <w:t xml:space="preserve"> v1.0 (2025-2026).</w:t>
       </w:r>
       <w:r>
         <w:rPr>
@@ -352,7 +352,7 @@
           <w:p>
             <w:pPr>
               <w:pageBreakBefore w:val="0"/>
-              <w:spacing w:after="200" w:lineRule="auto"/>
+              <w:spacing w:after="30" w:lineRule="auto" w:before="10" w:line="252"/>
               <w:jc w:val="left"/>
               <w:rPr>
                 <w:rFonts w:ascii="IBM Plex Sans" w:cs="IBM Plex Sans" w:eastAsia="IBM Plex Sans" w:hAnsi="IBM Plex Sans"/>
@@ -365,6 +365,161 @@
               <w:rPr>
                 <w:rtl w:val="0"/>
               </w:rPr>
+            </w:r>
+            <w:r>
+              <w:rPr>
+                <w:rFonts w:ascii="IBM Plex Sans" w:hAnsi="IBM Plex Sans" w:cs="IBM Plex Sans"/>
+                <w:b/>
+                <w:color w:val="003399"/>
+                <w:sz w:val="15"/>
+              </w:rPr>
+              <w:t xml:space="preserve">• </w:t>
+            </w:r>
+            <w:r>
+              <w:rPr>
+                <w:rFonts w:ascii="IBM Plex Sans" w:hAnsi="IBM Plex Sans" w:cs="IBM Plex Sans"/>
+                <w:b/>
+                <w:color w:val="111827"/>
+                <w:sz w:val="15"/>
+              </w:rPr>
+              <w:t xml:space="preserve">Tipo de Tarea: </w:t>
+            </w:r>
+            <w:r>
+              <w:rPr>
+                <w:rFonts w:ascii="IBM Plex Sans" w:hAnsi="IBM Plex Sans" w:cs="IBM Plex Sans"/>
+                <w:b w:val="0"/>
+                <w:color w:val="020094"/>
+                <w:sz w:val="15"/>
+              </w:rPr>
+              <w:t>Clasificación Multiclase Supervisada con ventana predictiva de 2 horas (t+1, t+2).</w:t>
+            </w:r>
+          </w:p>
+          <w:p>
+            <w:pPr>
+              <w:spacing w:before="10" w:after="30" w:line="252" w:lineRule="auto"/>
+            </w:pPr>
+            <w:r>
+              <w:rPr>
+                <w:rFonts w:ascii="IBM Plex Sans" w:hAnsi="IBM Plex Sans" w:cs="IBM Plex Sans"/>
+                <w:b/>
+                <w:color w:val="003399"/>
+                <w:sz w:val="15"/>
+              </w:rPr>
+              <w:t xml:space="preserve">• </w:t>
+            </w:r>
+            <w:r>
+              <w:rPr>
+                <w:rFonts w:ascii="IBM Plex Sans" w:hAnsi="IBM Plex Sans" w:cs="IBM Plex Sans"/>
+                <w:b/>
+                <w:color w:val="111827"/>
+                <w:sz w:val="15"/>
+              </w:rPr>
+              <w:t xml:space="preserve">Entidad: </w:t>
+            </w:r>
+            <w:r>
+              <w:rPr>
+                <w:rFonts w:ascii="IBM Plex Sans" w:hAnsi="IBM Plex Sans" w:cs="IBM Plex Sans"/>
+                <w:b w:val="0"/>
+                <w:color w:val="020094"/>
+                <w:sz w:val="15"/>
+              </w:rPr>
+              <w:t>Par estación-hora (s, t) para 470 estaciones activas de la red MiBici en el AMG.</w:t>
+            </w:r>
+          </w:p>
+          <w:p>
+            <w:pPr>
+              <w:spacing w:before="10" w:after="30" w:line="252" w:lineRule="auto"/>
+            </w:pPr>
+            <w:r>
+              <w:rPr>
+                <w:rFonts w:ascii="IBM Plex Sans" w:hAnsi="IBM Plex Sans" w:cs="IBM Plex Sans"/>
+                <w:b/>
+                <w:color w:val="003399"/>
+                <w:sz w:val="15"/>
+              </w:rPr>
+              <w:t xml:space="preserve">• </w:t>
+            </w:r>
+            <w:r>
+              <w:rPr>
+                <w:rFonts w:ascii="IBM Plex Sans" w:hAnsi="IBM Plex Sans" w:cs="IBM Plex Sans"/>
+                <w:b/>
+                <w:color w:val="111827"/>
+                <w:sz w:val="15"/>
+              </w:rPr>
+              <w:t xml:space="preserve">Target Operativo: </w:t>
+            </w:r>
+            <w:r>
+              <w:rPr>
+                <w:rFonts w:ascii="IBM Plex Sans" w:hAnsi="IBM Plex Sans" w:cs="IBM Plex Sans"/>
+                <w:b w:val="0"/>
+                <w:color w:val="020094"/>
+                <w:sz w:val="15"/>
+              </w:rPr>
+              <w:t>Ratio neto sobre capacidad: Ratio = Δnet / Capacidad_estación.</w:t>
+            </w:r>
+          </w:p>
+          <w:p>
+            <w:pPr>
+              <w:spacing w:before="10" w:after="30" w:line="252" w:lineRule="auto"/>
+            </w:pPr>
+            <w:r>
+              <w:rPr>
+                <w:rFonts w:ascii="IBM Plex Sans" w:hAnsi="IBM Plex Sans" w:cs="IBM Plex Sans"/>
+                <w:b/>
+                <w:color w:val="003399"/>
+                <w:sz w:val="15"/>
+              </w:rPr>
+              <w:t xml:space="preserve">• </w:t>
+            </w:r>
+            <w:r>
+              <w:rPr>
+                <w:rFonts w:ascii="IBM Plex Sans" w:hAnsi="IBM Plex Sans" w:cs="IBM Plex Sans"/>
+                <w:b/>
+                <w:color w:val="111827"/>
+                <w:sz w:val="15"/>
+              </w:rPr>
+              <w:t xml:space="preserve">Clases: </w:t>
+            </w:r>
+            <w:r>
+              <w:rPr>
+                <w:rFonts w:ascii="IBM Plex Sans" w:hAnsi="IBM Plex Sans" w:cs="IBM Plex Sans"/>
+                <w:b w:val="0"/>
+                <w:color w:val="020094"/>
+                <w:sz w:val="15"/>
+              </w:rPr>
+              <w:t>Clase 1 (Desabasto/Vacío): Ratio ≤ -0.50 | Clase 2 (Saturación/Lleno): Ratio ≥ 0.50 | Clase 0 (Normal): -0.50 &lt; Ratio &lt; 0.50.</w:t>
+            </w:r>
+          </w:p>
+          <w:p>
+            <w:pPr>
+              <w:spacing w:before="10" w:after="30" w:line="252" w:lineRule="auto"/>
+            </w:pPr>
+            <w:r>
+              <w:rPr>
+                <w:rFonts w:ascii="IBM Plex Sans" w:hAnsi="IBM Plex Sans" w:cs="IBM Plex Sans"/>
+                <w:b/>
+                <w:color w:val="003399"/>
+                <w:sz w:val="15"/>
+              </w:rPr>
+              <w:t xml:space="preserve">• </w:t>
+            </w:r>
+            <w:r>
+              <w:rPr>
+                <w:rFonts w:ascii="IBM Plex Sans" w:hAnsi="IBM Plex Sans" w:cs="IBM Plex Sans"/>
+                <w:b/>
+                <w:color w:val="111827"/>
+                <w:sz w:val="15"/>
+              </w:rPr>
+              <w:t xml:space="preserve">Observación: </w:t>
+            </w:r>
+            <w:r>
+              <w:rPr>
+                <w:rFonts w:ascii="IBM Plex Sans" w:hAnsi="IBM Plex Sans" w:cs="IBM Plex Sans"/>
+                <w:b w:val="0"/>
+                <w:color w:val="020094"/>
+                <w:sz w:val="15"/>
+              </w:rPr>
+              <w:t>Constatable 2 horas después de la inferencia al consolidar los viajes reales cerrados.</w:t>
             </w:r>
           </w:p>
         </w:tc>
@@ -471,7 +626,7 @@
           <w:p>
             <w:pPr>
               <w:pageBreakBefore w:val="0"/>
-              <w:spacing w:after="200" w:lineRule="auto"/>
+              <w:spacing w:after="30" w:lineRule="auto" w:before="10" w:line="252"/>
               <w:jc w:val="left"/>
               <w:rPr>
                 <w:rFonts w:ascii="IBM Plex Sans" w:cs="IBM Plex Sans" w:eastAsia="IBM Plex Sans" w:hAnsi="IBM Plex Sans"/>
@@ -481,6 +636,129 @@
               <w:rPr>
                 <w:rtl w:val="0"/>
               </w:rPr>
+            </w:r>
+            <w:r>
+              <w:rPr>
+                <w:rFonts w:ascii="IBM Plex Sans" w:hAnsi="IBM Plex Sans" w:cs="IBM Plex Sans"/>
+                <w:b/>
+                <w:color w:val="003399"/>
+                <w:sz w:val="15"/>
+              </w:rPr>
+              <w:t xml:space="preserve">• </w:t>
+            </w:r>
+            <w:r>
+              <w:rPr>
+                <w:rFonts w:ascii="IBM Plex Sans" w:hAnsi="IBM Plex Sans" w:cs="IBM Plex Sans"/>
+                <w:b/>
+                <w:color w:val="111827"/>
+                <w:sz w:val="15"/>
+              </w:rPr>
+              <w:t xml:space="preserve">Regla de Activación: </w:t>
+            </w:r>
+            <w:r>
+              <w:rPr>
+                <w:rFonts w:ascii="IBM Plex Sans" w:hAnsi="IBM Plex Sans" w:cs="IBM Plex Sans"/>
+                <w:b w:val="0"/>
+                <w:color w:val="020094"/>
+                <w:sz w:val="15"/>
+              </w:rPr>
+              <w:t>Alerta preventiva si probabilidad P(Desabasto) ≥ 0.50 o P(Saturación) ≥ 0.50.</w:t>
+            </w:r>
+          </w:p>
+          <w:p>
+            <w:pPr>
+              <w:spacing w:before="10" w:after="30" w:line="252" w:lineRule="auto"/>
+            </w:pPr>
+            <w:r>
+              <w:rPr>
+                <w:rFonts w:ascii="IBM Plex Sans" w:hAnsi="IBM Plex Sans" w:cs="IBM Plex Sans"/>
+                <w:b/>
+                <w:color w:val="003399"/>
+                <w:sz w:val="15"/>
+              </w:rPr>
+              <w:t xml:space="preserve">• </w:t>
+            </w:r>
+            <w:r>
+              <w:rPr>
+                <w:rFonts w:ascii="IBM Plex Sans" w:hAnsi="IBM Plex Sans" w:cs="IBM Plex Sans"/>
+                <w:b/>
+                <w:color w:val="111827"/>
+                <w:sz w:val="15"/>
+              </w:rPr>
+              <w:t xml:space="preserve">Priorización: </w:t>
+            </w:r>
+            <w:r>
+              <w:rPr>
+                <w:rFonts w:ascii="IBM Plex Sans" w:hAnsi="IBM Plex Sans" w:cs="IBM Plex Sans"/>
+                <w:b w:val="0"/>
+                <w:color w:val="020094"/>
+                <w:sz w:val="15"/>
+              </w:rPr>
+              <w:t>Severidad = P(Riesgo) × Capacidad, ordenando la cola de atención del CCO.</w:t>
+            </w:r>
+          </w:p>
+          <w:p>
+            <w:pPr>
+              <w:spacing w:before="10" w:after="30" w:line="252" w:lineRule="auto"/>
+            </w:pPr>
+            <w:r>
+              <w:rPr>
+                <w:rFonts w:ascii="IBM Plex Sans" w:hAnsi="IBM Plex Sans" w:cs="IBM Plex Sans"/>
+                <w:b/>
+                <w:color w:val="003399"/>
+                <w:sz w:val="15"/>
+              </w:rPr>
+              <w:t xml:space="preserve">• </w:t>
+            </w:r>
+            <w:r>
+              <w:rPr>
+                <w:rFonts w:ascii="IBM Plex Sans" w:hAnsi="IBM Plex Sans" w:cs="IBM Plex Sans"/>
+                <w:b/>
+                <w:color w:val="111827"/>
+                <w:sz w:val="15"/>
+              </w:rPr>
+              <w:t xml:space="preserve">Acción en Campo: </w:t>
+            </w:r>
+            <w:r>
+              <w:rPr>
+                <w:rFonts w:ascii="IBM Plex Sans" w:hAnsi="IBM Plex Sans" w:cs="IBM Plex Sans"/>
+                <w:b w:val="0"/>
+                <w:color w:val="020094"/>
+                <w:sz w:val="15"/>
+              </w:rPr>
+              <w:t>Despacho proactivo de cuadrillas: abastecer bicis antes de desabasto o retirar antes de saturar anclajes.</w:t>
+            </w:r>
+          </w:p>
+          <w:p>
+            <w:pPr>
+              <w:spacing w:before="10" w:after="30" w:line="252" w:lineRule="auto"/>
+            </w:pPr>
+            <w:r>
+              <w:rPr>
+                <w:rFonts w:ascii="IBM Plex Sans" w:hAnsi="IBM Plex Sans" w:cs="IBM Plex Sans"/>
+                <w:b/>
+                <w:color w:val="003399"/>
+                <w:sz w:val="15"/>
+              </w:rPr>
+              <w:t xml:space="preserve">• </w:t>
+            </w:r>
+            <w:r>
+              <w:rPr>
+                <w:rFonts w:ascii="IBM Plex Sans" w:hAnsi="IBM Plex Sans" w:cs="IBM Plex Sans"/>
+                <w:b/>
+                <w:color w:val="111827"/>
+                <w:sz w:val="15"/>
+              </w:rPr>
+              <w:t xml:space="preserve">Grupo de Control: </w:t>
+            </w:r>
+            <w:r>
+              <w:rPr>
+                <w:rFonts w:ascii="IBM Plex Sans" w:hAnsi="IBM Plex Sans" w:cs="IBM Plex Sans"/>
+                <w:b w:val="0"/>
+                <w:color w:val="020094"/>
+                <w:sz w:val="15"/>
+              </w:rPr>
+              <w:t>5% de estaciones críticas excluidas aleatoriamente para evaluar contrafactual de impacto.</w:t>
             </w:r>
           </w:p>
         </w:tc>
@@ -593,7 +871,7 @@
           <w:p>
             <w:pPr>
               <w:pageBreakBefore w:val="0"/>
-              <w:spacing w:after="200" w:lineRule="auto"/>
+              <w:spacing w:after="30" w:lineRule="auto" w:before="10" w:line="252"/>
               <w:jc w:val="left"/>
               <w:rPr>
                 <w:rFonts w:ascii="IBM Plex Sans" w:cs="IBM Plex Sans" w:eastAsia="IBM Plex Sans" w:hAnsi="IBM Plex Sans"/>
@@ -606,6 +884,65 @@
               <w:rPr>
                 <w:rtl w:val="0"/>
               </w:rPr>
+            </w:r>
+            <w:r>
+              <w:rPr>
+                <w:rFonts w:ascii="IBM Plex Sans" w:hAnsi="IBM Plex Sans" w:cs="IBM Plex Sans"/>
+                <w:b/>
+                <w:color w:val="003399"/>
+                <w:sz w:val="15"/>
+              </w:rPr>
+              <w:t xml:space="preserve">• </w:t>
+            </w:r>
+            <w:r>
+              <w:rPr>
+                <w:rFonts w:ascii="IBM Plex Sans" w:hAnsi="IBM Plex Sans" w:cs="IBM Plex Sans"/>
+                <w:b/>
+                <w:color w:val="111827"/>
+                <w:sz w:val="15"/>
+              </w:rPr>
+              <w:t xml:space="preserve">Beneficiarios: </w:t>
+            </w:r>
+            <w:r>
+              <w:rPr>
+                <w:rFonts w:ascii="IBM Plex Sans" w:hAnsi="IBM Plex Sans" w:cs="IBM Plex Sans"/>
+                <w:b w:val="0"/>
+                <w:color w:val="020094"/>
+                <w:sz w:val="15"/>
+              </w:rPr>
+              <w:t>Despachadores del CCO, cuadrillas de balanceo en campo y ciclistas urbanos del AMG.</w:t>
+            </w:r>
+          </w:p>
+          <w:p>
+            <w:pPr>
+              <w:spacing w:before="10" w:after="30" w:line="252" w:lineRule="auto"/>
+            </w:pPr>
+            <w:r>
+              <w:rPr>
+                <w:rFonts w:ascii="IBM Plex Sans" w:hAnsi="IBM Plex Sans" w:cs="IBM Plex Sans"/>
+                <w:b/>
+                <w:color w:val="003399"/>
+                <w:sz w:val="15"/>
+              </w:rPr>
+              <w:t xml:space="preserve">• </w:t>
+            </w:r>
+            <w:r>
+              <w:rPr>
+                <w:rFonts w:ascii="IBM Plex Sans" w:hAnsi="IBM Plex Sans" w:cs="IBM Plex Sans"/>
+                <w:b/>
+                <w:color w:val="111827"/>
+                <w:sz w:val="15"/>
+              </w:rPr>
+              <w:t xml:space="preserve">Puntos de Dolor: </w:t>
+            </w:r>
+            <w:r>
+              <w:rPr>
+                <w:rFonts w:ascii="IBM Plex Sans" w:hAnsi="IBM Plex Sans" w:cs="IBM Plex Sans"/>
+                <w:b w:val="0"/>
+                <w:color w:val="020094"/>
+                <w:sz w:val="15"/>
+              </w:rPr>
+              <w:t>Elimina el rebalanceo puramente reactivo tras quejas ciudadanas. Reduce viajes frustrados por falta de bicis o anclajes libres.</w:t>
             </w:r>
           </w:p>
         </w:tc>
@@ -716,7 +1053,7 @@
           <w:p>
             <w:pPr>
               <w:pageBreakBefore w:val="0"/>
-              <w:spacing w:after="200" w:lineRule="auto"/>
+              <w:spacing w:after="30" w:lineRule="auto" w:before="10" w:line="252"/>
               <w:jc w:val="left"/>
               <w:rPr>
                 <w:rFonts w:ascii="IBM Plex Sans" w:cs="IBM Plex Sans" w:eastAsia="IBM Plex Sans" w:hAnsi="IBM Plex Sans"/>
@@ -728,6 +1065,129 @@
               <w:rPr>
                 <w:rtl w:val="0"/>
               </w:rPr>
+            </w:r>
+            <w:r>
+              <w:rPr>
+                <w:rFonts w:ascii="IBM Plex Sans" w:hAnsi="IBM Plex Sans" w:cs="IBM Plex Sans"/>
+                <w:b/>
+                <w:color w:val="003399"/>
+                <w:sz w:val="15"/>
+              </w:rPr>
+              <w:t xml:space="preserve">• </w:t>
+            </w:r>
+            <w:r>
+              <w:rPr>
+                <w:rFonts w:ascii="IBM Plex Sans" w:hAnsi="IBM Plex Sans" w:cs="IBM Plex Sans"/>
+                <w:b/>
+                <w:color w:val="111827"/>
+                <w:sz w:val="15"/>
+              </w:rPr>
+              <w:t xml:space="preserve">Origen Inicial: </w:t>
+            </w:r>
+            <w:r>
+              <w:rPr>
+                <w:rFonts w:ascii="IBM Plex Sans" w:hAnsi="IBM Plex Sans" w:cs="IBM Plex Sans"/>
+                <w:b w:val="0"/>
+                <w:color w:val="020094"/>
+                <w:sz w:val="15"/>
+              </w:rPr>
+              <w:t>Scraping y descarga automatizada (src/data/p2_download_raw_data.py) del portal de Datos Abiertos MiBici.</w:t>
+            </w:r>
+          </w:p>
+          <w:p>
+            <w:pPr>
+              <w:spacing w:before="10" w:after="30" w:line="252" w:lineRule="auto"/>
+            </w:pPr>
+            <w:r>
+              <w:rPr>
+                <w:rFonts w:ascii="IBM Plex Sans" w:hAnsi="IBM Plex Sans" w:cs="IBM Plex Sans"/>
+                <w:b/>
+                <w:color w:val="003399"/>
+                <w:sz w:val="15"/>
+              </w:rPr>
+              <w:t xml:space="preserve">• </w:t>
+            </w:r>
+            <w:r>
+              <w:rPr>
+                <w:rFonts w:ascii="IBM Plex Sans" w:hAnsi="IBM Plex Sans" w:cs="IBM Plex Sans"/>
+                <w:b/>
+                <w:color w:val="111827"/>
+                <w:sz w:val="15"/>
+              </w:rPr>
+              <w:t xml:space="preserve">Volumen Histórico: </w:t>
+            </w:r>
+            <w:r>
+              <w:rPr>
+                <w:rFonts w:ascii="IBM Plex Sans" w:hAnsi="IBM Plex Sans" w:cs="IBM Plex Sans"/>
+                <w:b w:val="0"/>
+                <w:color w:val="020094"/>
+                <w:sz w:val="15"/>
+              </w:rPr>
+              <w:t>21 archivos mensuales de viajes (2025 completo + 2026 hasta sep: 7.89M viajes) y catálogo nomenclatura 2026_09.</w:t>
+            </w:r>
+          </w:p>
+          <w:p>
+            <w:pPr>
+              <w:spacing w:before="10" w:after="30" w:line="252" w:lineRule="auto"/>
+            </w:pPr>
+            <w:r>
+              <w:rPr>
+                <w:rFonts w:ascii="IBM Plex Sans" w:hAnsi="IBM Plex Sans" w:cs="IBM Plex Sans"/>
+                <w:b/>
+                <w:color w:val="003399"/>
+                <w:sz w:val="15"/>
+              </w:rPr>
+              <w:t xml:space="preserve">• </w:t>
+            </w:r>
+            <w:r>
+              <w:rPr>
+                <w:rFonts w:ascii="IBM Plex Sans" w:hAnsi="IBM Plex Sans" w:cs="IBM Plex Sans"/>
+                <w:b/>
+                <w:color w:val="111827"/>
+                <w:sz w:val="15"/>
+              </w:rPr>
+              <w:t xml:space="preserve">Versionado Criptográfico: </w:t>
+            </w:r>
+            <w:r>
+              <w:rPr>
+                <w:rFonts w:ascii="IBM Plex Sans" w:hAnsi="IBM Plex Sans" w:cs="IBM Plex Sans"/>
+                <w:b w:val="0"/>
+                <w:color w:val="020094"/>
+                <w:sz w:val="15"/>
+              </w:rPr>
+              <w:t>Manifiesto en references/p2_data_manifest.json con SHA-256 (Versión: p2-mibici-v2025_2026-ddfa3aa49c).</w:t>
+            </w:r>
+          </w:p>
+          <w:p>
+            <w:pPr>
+              <w:spacing w:before="10" w:after="30" w:line="252" w:lineRule="auto"/>
+            </w:pPr>
+            <w:r>
+              <w:rPr>
+                <w:rFonts w:ascii="IBM Plex Sans" w:hAnsi="IBM Plex Sans" w:cs="IBM Plex Sans"/>
+                <w:b/>
+                <w:color w:val="003399"/>
+                <w:sz w:val="15"/>
+              </w:rPr>
+              <w:t xml:space="preserve">• </w:t>
+            </w:r>
+            <w:r>
+              <w:rPr>
+                <w:rFonts w:ascii="IBM Plex Sans" w:hAnsi="IBM Plex Sans" w:cs="IBM Plex Sans"/>
+                <w:b/>
+                <w:color w:val="111827"/>
+                <w:sz w:val="15"/>
+              </w:rPr>
+              <w:t xml:space="preserve">Estrategia Continua: </w:t>
+            </w:r>
+            <w:r>
+              <w:rPr>
+                <w:rFonts w:ascii="IBM Plex Sans" w:hAnsi="IBM Plex Sans" w:cs="IBM Plex Sans"/>
+                <w:b w:val="0"/>
+                <w:color w:val="020094"/>
+                <w:sz w:val="15"/>
+              </w:rPr>
+              <w:t>Micro-lotes incrementales horarios guardados en Parquet con compresión Snappy para costo mínimo de I/O.</w:t>
             </w:r>
           </w:p>
         </w:tc>
@@ -834,7 +1294,7 @@
           <w:p>
             <w:pPr>
               <w:pageBreakBefore w:val="0"/>
-              <w:spacing w:after="200" w:lineRule="auto"/>
+              <w:spacing w:after="30" w:lineRule="auto" w:before="10" w:line="252"/>
               <w:jc w:val="left"/>
               <w:rPr>
                 <w:rFonts w:ascii="IBM Plex Sans" w:cs="IBM Plex Sans" w:eastAsia="IBM Plex Sans" w:hAnsi="IBM Plex Sans"/>
@@ -849,6 +1309,129 @@
               <w:rPr>
                 <w:rtl w:val="0"/>
               </w:rPr>
+            </w:r>
+            <w:r>
+              <w:rPr>
+                <w:rFonts w:ascii="IBM Plex Sans" w:hAnsi="IBM Plex Sans" w:cs="IBM Plex Sans"/>
+                <w:b/>
+                <w:color w:val="003399"/>
+                <w:sz w:val="15"/>
+              </w:rPr>
+              <w:t xml:space="preserve">• </w:t>
+            </w:r>
+            <w:r>
+              <w:rPr>
+                <w:rFonts w:ascii="IBM Plex Sans" w:hAnsi="IBM Plex Sans" w:cs="IBM Plex Sans"/>
+                <w:b/>
+                <w:color w:val="111827"/>
+                <w:sz w:val="15"/>
+              </w:rPr>
+              <w:t xml:space="preserve">Histórico Transaccional: </w:t>
+            </w:r>
+            <w:r>
+              <w:rPr>
+                <w:rFonts w:ascii="IBM Plex Sans" w:hAnsi="IBM Plex Sans" w:cs="IBM Plex Sans"/>
+                <w:b w:val="0"/>
+                <w:color w:val="020094"/>
+                <w:sz w:val="15"/>
+              </w:rPr>
+              <w:t>Tablas de viajes MiBici: Viaje_Id, Inicio_del_viaje, Fin_del_viaje, Origen_Id, Destino_Id, Usuario_Id.</w:t>
+            </w:r>
+          </w:p>
+          <w:p>
+            <w:pPr>
+              <w:spacing w:before="10" w:after="30" w:line="252" w:lineRule="auto"/>
+            </w:pPr>
+            <w:r>
+              <w:rPr>
+                <w:rFonts w:ascii="IBM Plex Sans" w:hAnsi="IBM Plex Sans" w:cs="IBM Plex Sans"/>
+                <w:b/>
+                <w:color w:val="003399"/>
+                <w:sz w:val="15"/>
+              </w:rPr>
+              <w:t xml:space="preserve">• </w:t>
+            </w:r>
+            <w:r>
+              <w:rPr>
+                <w:rFonts w:ascii="IBM Plex Sans" w:hAnsi="IBM Plex Sans" w:cs="IBM Plex Sans"/>
+                <w:b/>
+                <w:color w:val="111827"/>
+                <w:sz w:val="15"/>
+              </w:rPr>
+              <w:t xml:space="preserve">Catálogo de Infraestructura: </w:t>
+            </w:r>
+            <w:r>
+              <w:rPr>
+                <w:rFonts w:ascii="IBM Plex Sans" w:hAnsi="IBM Plex Sans" w:cs="IBM Plex Sans"/>
+                <w:b w:val="0"/>
+                <w:color w:val="020094"/>
+                <w:sz w:val="15"/>
+              </w:rPr>
+              <w:t>Estaciones en nomenclatura_2026_09.csv: id, name, latitude, longitude, dpcapacity (capacidad física).</w:t>
+            </w:r>
+          </w:p>
+          <w:p>
+            <w:pPr>
+              <w:spacing w:before="10" w:after="30" w:line="252" w:lineRule="auto"/>
+            </w:pPr>
+            <w:r>
+              <w:rPr>
+                <w:rFonts w:ascii="IBM Plex Sans" w:hAnsi="IBM Plex Sans" w:cs="IBM Plex Sans"/>
+                <w:b/>
+                <w:color w:val="003399"/>
+                <w:sz w:val="15"/>
+              </w:rPr>
+              <w:t xml:space="preserve">• </w:t>
+            </w:r>
+            <w:r>
+              <w:rPr>
+                <w:rFonts w:ascii="IBM Plex Sans" w:hAnsi="IBM Plex Sans" w:cs="IBM Plex Sans"/>
+                <w:b/>
+                <w:color w:val="111827"/>
+                <w:sz w:val="15"/>
+              </w:rPr>
+              <w:t xml:space="preserve">Calendario Oficial: </w:t>
+            </w:r>
+            <w:r>
+              <w:rPr>
+                <w:rFonts w:ascii="IBM Plex Sans" w:hAnsi="IBM Plex Sans" w:cs="IBM Plex Sans"/>
+                <w:b w:val="0"/>
+                <w:color w:val="020094"/>
+                <w:sz w:val="15"/>
+              </w:rPr>
+              <w:t>Días laborales, fines de semana, festivos oficiales y ciclovías recreativas dominicales del AMG.</w:t>
+            </w:r>
+          </w:p>
+          <w:p>
+            <w:pPr>
+              <w:spacing w:before="10" w:after="30" w:line="252" w:lineRule="auto"/>
+            </w:pPr>
+            <w:r>
+              <w:rPr>
+                <w:rFonts w:ascii="IBM Plex Sans" w:hAnsi="IBM Plex Sans" w:cs="IBM Plex Sans"/>
+                <w:b/>
+                <w:color w:val="003399"/>
+                <w:sz w:val="15"/>
+              </w:rPr>
+              <w:t xml:space="preserve">• </w:t>
+            </w:r>
+            <w:r>
+              <w:rPr>
+                <w:rFonts w:ascii="IBM Plex Sans" w:hAnsi="IBM Plex Sans" w:cs="IBM Plex Sans"/>
+                <w:b/>
+                <w:color w:val="111827"/>
+                <w:sz w:val="15"/>
+              </w:rPr>
+              <w:t xml:space="preserve">Datos Climáticos (Ext): </w:t>
+            </w:r>
+            <w:r>
+              <w:rPr>
+                <w:rFonts w:ascii="IBM Plex Sans" w:hAnsi="IBM Plex Sans" w:cs="IBM Plex Sans"/>
+                <w:b w:val="0"/>
+                <w:color w:val="020094"/>
+                <w:sz w:val="15"/>
+              </w:rPr>
+              <w:t>API meteorológica local (precipitación y temperatura) como covariables exógenas de demanda.</w:t>
             </w:r>
           </w:p>
         </w:tc>
@@ -968,7 +1551,7 @@
           <w:p>
             <w:pPr>
               <w:pageBreakBefore w:val="0"/>
-              <w:spacing w:after="200" w:lineRule="auto"/>
+              <w:spacing w:after="30" w:lineRule="auto" w:before="10" w:line="252"/>
               <w:jc w:val="left"/>
               <w:rPr>
                 <w:rFonts w:ascii="IBM Plex Sans" w:cs="IBM Plex Sans" w:eastAsia="IBM Plex Sans" w:hAnsi="IBM Plex Sans"/>
@@ -981,6 +1564,65 @@
               <w:rPr>
                 <w:rtl w:val="0"/>
               </w:rPr>
+            </w:r>
+            <w:r>
+              <w:rPr>
+                <w:rFonts w:ascii="IBM Plex Sans" w:hAnsi="IBM Plex Sans" w:cs="IBM Plex Sans"/>
+                <w:b/>
+                <w:color w:val="003399"/>
+                <w:sz w:val="15"/>
+              </w:rPr>
+              <w:t xml:space="preserve">• </w:t>
+            </w:r>
+            <w:r>
+              <w:rPr>
+                <w:rFonts w:ascii="IBM Plex Sans" w:hAnsi="IBM Plex Sans" w:cs="IBM Plex Sans"/>
+                <w:b/>
+                <w:color w:val="111827"/>
+                <w:sz w:val="15"/>
+              </w:rPr>
+              <w:t xml:space="preserve">Costos Asimétricos: </w:t>
+            </w:r>
+            <w:r>
+              <w:rPr>
+                <w:rFonts w:ascii="IBM Plex Sans" w:hAnsi="IBM Plex Sans" w:cs="IBM Plex Sans"/>
+                <w:b w:val="0"/>
+                <w:color w:val="020094"/>
+                <w:sz w:val="15"/>
+              </w:rPr>
+              <w:t>FN (Crítico): Usuario varado sin bici/anclaje; daño reputacional y desuso. FP (Bajo): Inspección preventiva a estación con holgura (&lt; $50 MXN marginales).</w:t>
+            </w:r>
+          </w:p>
+          <w:p>
+            <w:pPr>
+              <w:spacing w:before="10" w:after="30" w:line="252" w:lineRule="auto"/>
+            </w:pPr>
+            <w:r>
+              <w:rPr>
+                <w:rFonts w:ascii="IBM Plex Sans" w:hAnsi="IBM Plex Sans" w:cs="IBM Plex Sans"/>
+                <w:b/>
+                <w:color w:val="003399"/>
+                <w:sz w:val="15"/>
+              </w:rPr>
+              <w:t xml:space="preserve">• </w:t>
+            </w:r>
+            <w:r>
+              <w:rPr>
+                <w:rFonts w:ascii="IBM Plex Sans" w:hAnsi="IBM Plex Sans" w:cs="IBM Plex Sans"/>
+                <w:b/>
+                <w:color w:val="111827"/>
+                <w:sz w:val="15"/>
+              </w:rPr>
+              <w:t xml:space="preserve">Datos de Simulación: </w:t>
+            </w:r>
+            <w:r>
+              <w:rPr>
+                <w:rFonts w:ascii="IBM Plex Sans" w:hAnsi="IBM Plex Sans" w:cs="IBM Plex Sans"/>
+                <w:b w:val="0"/>
+                <w:color w:val="020094"/>
+                <w:sz w:val="15"/>
+              </w:rPr>
+              <w:t>Partición cronológica estricta: Train 2025 (4.04M registros) y Test/Simulación Ene-Sep 2026 (3.08M registros).</w:t>
             </w:r>
           </w:p>
         </w:tc>
@@ -1099,7 +1741,7 @@
           <w:p>
             <w:pPr>
               <w:pageBreakBefore w:val="0"/>
-              <w:spacing w:after="200" w:lineRule="auto"/>
+              <w:spacing w:after="30" w:lineRule="auto" w:before="10" w:line="252"/>
               <w:jc w:val="left"/>
               <w:rPr>
                 <w:rFonts w:ascii="IBM Plex Sans" w:cs="IBM Plex Sans" w:eastAsia="IBM Plex Sans" w:hAnsi="IBM Plex Sans"/>
@@ -1114,6 +1756,129 @@
               <w:rPr>
                 <w:rtl w:val="0"/>
               </w:rPr>
+            </w:r>
+            <w:r>
+              <w:rPr>
+                <w:rFonts w:ascii="IBM Plex Sans" w:hAnsi="IBM Plex Sans" w:cs="IBM Plex Sans"/>
+                <w:b/>
+                <w:color w:val="003399"/>
+                <w:sz w:val="15"/>
+              </w:rPr>
+              <w:t xml:space="preserve">• </w:t>
+            </w:r>
+            <w:r>
+              <w:rPr>
+                <w:rFonts w:ascii="IBM Plex Sans" w:hAnsi="IBM Plex Sans" w:cs="IBM Plex Sans"/>
+                <w:b/>
+                <w:color w:val="111827"/>
+                <w:sz w:val="15"/>
+              </w:rPr>
+              <w:t xml:space="preserve">Modo y Frecuencia: </w:t>
+            </w:r>
+            <w:r>
+              <w:rPr>
+                <w:rFonts w:ascii="IBM Plex Sans" w:hAnsi="IBM Plex Sans" w:cs="IBM Plex Sans"/>
+                <w:b w:val="0"/>
+                <w:color w:val="020094"/>
+                <w:sz w:val="15"/>
+              </w:rPr>
+              <w:t>Inferencia por lotes programada (Scheduled Batch Scoring) cada hora en el minuto :55.</w:t>
+            </w:r>
+          </w:p>
+          <w:p>
+            <w:pPr>
+              <w:spacing w:before="10" w:after="30" w:line="252" w:lineRule="auto"/>
+            </w:pPr>
+            <w:r>
+              <w:rPr>
+                <w:rFonts w:ascii="IBM Plex Sans" w:hAnsi="IBM Plex Sans" w:cs="IBM Plex Sans"/>
+                <w:b/>
+                <w:color w:val="003399"/>
+                <w:sz w:val="15"/>
+              </w:rPr>
+              <w:t xml:space="preserve">• </w:t>
+            </w:r>
+            <w:r>
+              <w:rPr>
+                <w:rFonts w:ascii="IBM Plex Sans" w:hAnsi="IBM Plex Sans" w:cs="IBM Plex Sans"/>
+                <w:b/>
+                <w:color w:val="111827"/>
+                <w:sz w:val="15"/>
+              </w:rPr>
+              <w:t xml:space="preserve">Presupuesto de Tiempo: </w:t>
+            </w:r>
+            <w:r>
+              <w:rPr>
+                <w:rFonts w:ascii="IBM Plex Sans" w:hAnsi="IBM Plex Sans" w:cs="IBM Plex Sans"/>
+                <w:b w:val="0"/>
+                <w:color w:val="020094"/>
+                <w:sz w:val="15"/>
+              </w:rPr>
+              <w:t>Ventana de 60 s. Tiempo real: &lt; 10 s para las 470 estaciones en CPU estándar.</w:t>
+            </w:r>
+          </w:p>
+          <w:p>
+            <w:pPr>
+              <w:spacing w:before="10" w:after="30" w:line="252" w:lineRule="auto"/>
+            </w:pPr>
+            <w:r>
+              <w:rPr>
+                <w:rFonts w:ascii="IBM Plex Sans" w:hAnsi="IBM Plex Sans" w:cs="IBM Plex Sans"/>
+                <w:b/>
+                <w:color w:val="003399"/>
+                <w:sz w:val="15"/>
+              </w:rPr>
+              <w:t xml:space="preserve">• </w:t>
+            </w:r>
+            <w:r>
+              <w:rPr>
+                <w:rFonts w:ascii="IBM Plex Sans" w:hAnsi="IBM Plex Sans" w:cs="IBM Plex Sans"/>
+                <w:b/>
+                <w:color w:val="111827"/>
+                <w:sz w:val="15"/>
+              </w:rPr>
+              <w:t xml:space="preserve">Recursos Cómputo: </w:t>
+            </w:r>
+            <w:r>
+              <w:rPr>
+                <w:rFonts w:ascii="IBM Plex Sans" w:hAnsi="IBM Plex Sans" w:cs="IBM Plex Sans"/>
+                <w:b w:val="0"/>
+                <w:color w:val="020094"/>
+                <w:sz w:val="15"/>
+              </w:rPr>
+              <w:t>Servidor liviano (1 vCPU, 2 GB RAM). Modelo serializado Joblib de ~3.2 MB.</w:t>
+            </w:r>
+          </w:p>
+          <w:p>
+            <w:pPr>
+              <w:spacing w:before="10" w:after="30" w:line="252" w:lineRule="auto"/>
+            </w:pPr>
+            <w:r>
+              <w:rPr>
+                <w:rFonts w:ascii="IBM Plex Sans" w:hAnsi="IBM Plex Sans" w:cs="IBM Plex Sans"/>
+                <w:b/>
+                <w:color w:val="003399"/>
+                <w:sz w:val="15"/>
+              </w:rPr>
+              <w:t xml:space="preserve">• </w:t>
+            </w:r>
+            <w:r>
+              <w:rPr>
+                <w:rFonts w:ascii="IBM Plex Sans" w:hAnsi="IBM Plex Sans" w:cs="IBM Plex Sans"/>
+                <w:b/>
+                <w:color w:val="111827"/>
+                <w:sz w:val="15"/>
+              </w:rPr>
+              <w:t xml:space="preserve">Salida Serializada: </w:t>
+            </w:r>
+            <w:r>
+              <w:rPr>
+                <w:rFonts w:ascii="IBM Plex Sans" w:hAnsi="IBM Plex Sans" w:cs="IBM Plex Sans"/>
+                <w:b w:val="0"/>
+                <w:color w:val="020094"/>
+                <w:sz w:val="15"/>
+              </w:rPr>
+              <w:t>Probabilidades [P_normal, P_desabasto, P_saturacion] guardadas en data/processed/p2_test_predictions.parquet.</w:t>
             </w:r>
           </w:p>
         </w:tc>
@@ -1137,7 +1902,7 @@
           <w:p>
             <w:pPr>
               <w:pageBreakBefore w:val="0"/>
-              <w:spacing w:after="200" w:lineRule="auto"/>
+              <w:spacing w:after="30" w:lineRule="auto" w:before="10" w:line="252"/>
               <w:jc w:val="left"/>
               <w:rPr>
                 <w:rFonts w:ascii="IBM Plex Sans" w:cs="IBM Plex Sans" w:eastAsia="IBM Plex Sans" w:hAnsi="IBM Plex Sans"/>
@@ -1152,6 +1917,65 @@
               <w:rPr>
                 <w:rtl w:val="0"/>
               </w:rPr>
+            </w:r>
+            <w:r>
+              <w:rPr>
+                <w:rFonts w:ascii="IBM Plex Sans" w:hAnsi="IBM Plex Sans" w:cs="IBM Plex Sans"/>
+                <w:b/>
+                <w:color w:val="003399"/>
+                <w:sz w:val="15"/>
+              </w:rPr>
+              <w:t xml:space="preserve">• </w:t>
+            </w:r>
+            <w:r>
+              <w:rPr>
+                <w:rFonts w:ascii="IBM Plex Sans" w:hAnsi="IBM Plex Sans" w:cs="IBM Plex Sans"/>
+                <w:b/>
+                <w:color w:val="111827"/>
+                <w:sz w:val="15"/>
+              </w:rPr>
+              <w:t xml:space="preserve">Integración Operativa: </w:t>
+            </w:r>
+            <w:r>
+              <w:rPr>
+                <w:rFonts w:ascii="IBM Plex Sans" w:hAnsi="IBM Plex Sans" w:cs="IBM Plex Sans"/>
+                <w:b w:val="0"/>
+                <w:color w:val="020094"/>
+                <w:sz w:val="15"/>
+              </w:rPr>
+              <w:t>Panel georreferenciado en CCO con semáforo de riesgo e itinerarios en tabletas de cuadrillas 60 min antes del pico.</w:t>
+            </w:r>
+          </w:p>
+          <w:p>
+            <w:pPr>
+              <w:spacing w:before="10" w:after="30" w:line="252" w:lineRule="auto"/>
+            </w:pPr>
+            <w:r>
+              <w:rPr>
+                <w:rFonts w:ascii="IBM Plex Sans" w:hAnsi="IBM Plex Sans" w:cs="IBM Plex Sans"/>
+                <w:b/>
+                <w:color w:val="003399"/>
+                <w:sz w:val="15"/>
+              </w:rPr>
+              <w:t xml:space="preserve">• </w:t>
+            </w:r>
+            <w:r>
+              <w:rPr>
+                <w:rFonts w:ascii="IBM Plex Sans" w:hAnsi="IBM Plex Sans" w:cs="IBM Plex Sans"/>
+                <w:b/>
+                <w:color w:val="111827"/>
+                <w:sz w:val="15"/>
+              </w:rPr>
+              <w:t xml:space="preserve">Valor Agregado: </w:t>
+            </w:r>
+            <w:r>
+              <w:rPr>
+                <w:rFonts w:ascii="IBM Plex Sans" w:hAnsi="IBM Plex Sans" w:cs="IBM Plex Sans"/>
+                <w:b w:val="0"/>
+                <w:color w:val="020094"/>
+                <w:sz w:val="15"/>
+              </w:rPr>
+              <w:t>Disponibilidad garantizada en horas críticas, fidelización del usuario y optimización de rutas y combustible de la flota.</w:t>
             </w:r>
           </w:p>
         </w:tc>
@@ -1264,7 +2088,7 @@
           <w:p>
             <w:pPr>
               <w:pageBreakBefore w:val="0"/>
-              <w:spacing w:after="200" w:lineRule="auto"/>
+              <w:spacing w:after="30" w:lineRule="auto" w:before="10" w:line="252"/>
               <w:jc w:val="left"/>
               <w:rPr>
                 <w:rFonts w:ascii="IBM Plex Sans" w:cs="IBM Plex Sans" w:eastAsia="IBM Plex Sans" w:hAnsi="IBM Plex Sans"/>
@@ -1277,6 +2101,129 @@
               <w:rPr>
                 <w:rtl w:val="0"/>
               </w:rPr>
+            </w:r>
+            <w:r>
+              <w:rPr>
+                <w:rFonts w:ascii="IBM Plex Sans" w:hAnsi="IBM Plex Sans" w:cs="IBM Plex Sans"/>
+                <w:b/>
+                <w:color w:val="003399"/>
+                <w:sz w:val="15"/>
+              </w:rPr>
+              <w:t xml:space="preserve">• </w:t>
+            </w:r>
+            <w:r>
+              <w:rPr>
+                <w:rFonts w:ascii="IBM Plex Sans" w:hAnsi="IBM Plex Sans" w:cs="IBM Plex Sans"/>
+                <w:b/>
+                <w:color w:val="111827"/>
+                <w:sz w:val="15"/>
+              </w:rPr>
+              <w:t xml:space="preserve">Arquitectura: </w:t>
+            </w:r>
+            <w:r>
+              <w:rPr>
+                <w:rFonts w:ascii="IBM Plex Sans" w:hAnsi="IBM Plex Sans" w:cs="IBM Plex Sans"/>
+                <w:b w:val="0"/>
+                <w:color w:val="020094"/>
+                <w:sz w:val="15"/>
+              </w:rPr>
+              <w:t>1 modelo global multiclase LGBMClassifier que generaliza patrones compartidos en toda la red de estaciones.</w:t>
+            </w:r>
+          </w:p>
+          <w:p>
+            <w:pPr>
+              <w:spacing w:before="10" w:after="30" w:line="252" w:lineRule="auto"/>
+            </w:pPr>
+            <w:r>
+              <w:rPr>
+                <w:rFonts w:ascii="IBM Plex Sans" w:hAnsi="IBM Plex Sans" w:cs="IBM Plex Sans"/>
+                <w:b/>
+                <w:color w:val="003399"/>
+                <w:sz w:val="15"/>
+              </w:rPr>
+              <w:t xml:space="preserve">• </w:t>
+            </w:r>
+            <w:r>
+              <w:rPr>
+                <w:rFonts w:ascii="IBM Plex Sans" w:hAnsi="IBM Plex Sans" w:cs="IBM Plex Sans"/>
+                <w:b/>
+                <w:color w:val="111827"/>
+                <w:sz w:val="15"/>
+              </w:rPr>
+              <w:t xml:space="preserve">Manejo de Desbalance: </w:t>
+            </w:r>
+            <w:r>
+              <w:rPr>
+                <w:rFonts w:ascii="IBM Plex Sans" w:hAnsi="IBM Plex Sans" w:cs="IBM Plex Sans"/>
+                <w:b w:val="0"/>
+                <w:color w:val="020094"/>
+                <w:sz w:val="15"/>
+              </w:rPr>
+              <w:t>Ponderación class_weight='balanced' para penalizar fuertemente errores en clases de riesgo (&lt; 1% de prevalencia).</w:t>
+            </w:r>
+          </w:p>
+          <w:p>
+            <w:pPr>
+              <w:spacing w:before="10" w:after="30" w:line="252" w:lineRule="auto"/>
+            </w:pPr>
+            <w:r>
+              <w:rPr>
+                <w:rFonts w:ascii="IBM Plex Sans" w:hAnsi="IBM Plex Sans" w:cs="IBM Plex Sans"/>
+                <w:b/>
+                <w:color w:val="003399"/>
+                <w:sz w:val="15"/>
+              </w:rPr>
+              <w:t xml:space="preserve">• </w:t>
+            </w:r>
+            <w:r>
+              <w:rPr>
+                <w:rFonts w:ascii="IBM Plex Sans" w:hAnsi="IBM Plex Sans" w:cs="IBM Plex Sans"/>
+                <w:b/>
+                <w:color w:val="111827"/>
+                <w:sz w:val="15"/>
+              </w:rPr>
+              <w:t xml:space="preserve">Cadencia de Actualización: </w:t>
+            </w:r>
+            <w:r>
+              <w:rPr>
+                <w:rFonts w:ascii="IBM Plex Sans" w:hAnsi="IBM Plex Sans" w:cs="IBM Plex Sans"/>
+                <w:b w:val="0"/>
+                <w:color w:val="020094"/>
+                <w:sz w:val="15"/>
+              </w:rPr>
+              <w:t>Re-entrenamiento mensual programado o disparado si Macro F1 móvil &lt; 0.35.</w:t>
+            </w:r>
+          </w:p>
+          <w:p>
+            <w:pPr>
+              <w:spacing w:before="10" w:after="30" w:line="252" w:lineRule="auto"/>
+            </w:pPr>
+            <w:r>
+              <w:rPr>
+                <w:rFonts w:ascii="IBM Plex Sans" w:hAnsi="IBM Plex Sans" w:cs="IBM Plex Sans"/>
+                <w:b/>
+                <w:color w:val="003399"/>
+                <w:sz w:val="15"/>
+              </w:rPr>
+              <w:t xml:space="preserve">• </w:t>
+            </w:r>
+            <w:r>
+              <w:rPr>
+                <w:rFonts w:ascii="IBM Plex Sans" w:hAnsi="IBM Plex Sans" w:cs="IBM Plex Sans"/>
+                <w:b/>
+                <w:color w:val="111827"/>
+                <w:sz w:val="15"/>
+              </w:rPr>
+              <w:t xml:space="preserve">Cómputo de Entrenamiento: </w:t>
+            </w:r>
+            <w:r>
+              <w:rPr>
+                <w:rFonts w:ascii="IBM Plex Sans" w:hAnsi="IBM Plex Sans" w:cs="IBM Plex Sans"/>
+                <w:b w:val="0"/>
+                <w:color w:val="020094"/>
+                <w:sz w:val="15"/>
+              </w:rPr>
+              <w:t>Ejecutado en ~45 s sobre 4 vCPUs sin GPU; trazabilidad y versionado integral en MLflow.</w:t>
             </w:r>
           </w:p>
         </w:tc>
@@ -1391,7 +2338,7 @@
           <w:p>
             <w:pPr>
               <w:pageBreakBefore w:val="0"/>
-              <w:spacing w:after="200" w:lineRule="auto"/>
+              <w:spacing w:after="30" w:lineRule="auto" w:before="10" w:line="252"/>
               <w:jc w:val="left"/>
               <w:rPr>
                 <w:rFonts w:ascii="IBM Plex Sans" w:cs="IBM Plex Sans" w:eastAsia="IBM Plex Sans" w:hAnsi="IBM Plex Sans"/>
@@ -1404,6 +2351,97 @@
               <w:rPr>
                 <w:rtl w:val="0"/>
               </w:rPr>
+            </w:r>
+            <w:r>
+              <w:rPr>
+                <w:rFonts w:ascii="IBM Plex Sans" w:hAnsi="IBM Plex Sans" w:cs="IBM Plex Sans"/>
+                <w:b/>
+                <w:color w:val="003399"/>
+                <w:sz w:val="15"/>
+              </w:rPr>
+              <w:t xml:space="preserve">• </w:t>
+            </w:r>
+            <w:r>
+              <w:rPr>
+                <w:rFonts w:ascii="IBM Plex Sans" w:hAnsi="IBM Plex Sans" w:cs="IBM Plex Sans"/>
+                <w:b/>
+                <w:color w:val="111827"/>
+                <w:sz w:val="15"/>
+              </w:rPr>
+              <w:t xml:space="preserve">Rejilla Espaciotemporal: </w:t>
+            </w:r>
+            <w:r>
+              <w:rPr>
+                <w:rFonts w:ascii="IBM Plex Sans" w:hAnsi="IBM Plex Sans" w:cs="IBM Plex Sans"/>
+                <w:b w:val="0"/>
+                <w:color w:val="020094"/>
+                <w:sz w:val="15"/>
+              </w:rPr>
+              <w:t>470 estaciones × 15,312 horas continuas con Zero-Filling para representar inactividad real.</w:t>
+            </w:r>
+          </w:p>
+          <w:p>
+            <w:pPr>
+              <w:spacing w:before="10" w:after="30" w:line="252" w:lineRule="auto"/>
+            </w:pPr>
+            <w:r>
+              <w:rPr>
+                <w:rFonts w:ascii="IBM Plex Sans" w:hAnsi="IBM Plex Sans" w:cs="IBM Plex Sans"/>
+                <w:b/>
+                <w:color w:val="003399"/>
+                <w:sz w:val="15"/>
+              </w:rPr>
+              <w:t xml:space="preserve">• </w:t>
+            </w:r>
+            <w:r>
+              <w:rPr>
+                <w:rFonts w:ascii="IBM Plex Sans" w:hAnsi="IBM Plex Sans" w:cs="IBM Plex Sans"/>
+                <w:b/>
+                <w:color w:val="111827"/>
+                <w:sz w:val="15"/>
+              </w:rPr>
+              <w:t xml:space="preserve">Lags de Oferta y Demanda: </w:t>
+            </w:r>
+            <w:r>
+              <w:rPr>
+                <w:rFonts w:ascii="IBM Plex Sans" w:hAnsi="IBM Plex Sans" w:cs="IBM Plex Sans"/>
+                <w:b w:val="0"/>
+                <w:color w:val="020094"/>
+                <w:sz w:val="15"/>
+              </w:rPr>
+              <w:t>Salidas y llegadas pasadas en t-1, t-2, t-24 (día previo) y t-168 (semana previa).</w:t>
+            </w:r>
+          </w:p>
+          <w:p>
+            <w:pPr>
+              <w:spacing w:before="10" w:after="30" w:line="252" w:lineRule="auto"/>
+            </w:pPr>
+            <w:r>
+              <w:rPr>
+                <w:rFonts w:ascii="IBM Plex Sans" w:hAnsi="IBM Plex Sans" w:cs="IBM Plex Sans"/>
+                <w:b/>
+                <w:color w:val="003399"/>
+                <w:sz w:val="15"/>
+              </w:rPr>
+              <w:t xml:space="preserve">• </w:t>
+            </w:r>
+            <w:r>
+              <w:rPr>
+                <w:rFonts w:ascii="IBM Plex Sans" w:hAnsi="IBM Plex Sans" w:cs="IBM Plex Sans"/>
+                <w:b/>
+                <w:color w:val="111827"/>
+                <w:sz w:val="15"/>
+              </w:rPr>
+              <w:t xml:space="preserve">Dinámica de Flujo Neto: </w:t>
+            </w:r>
+            <w:r>
+              <w:rPr>
+                <w:rFonts w:ascii="IBM Plex Sans" w:hAnsi="IBM Plex Sans" w:cs="IBM Plex Sans"/>
+                <w:b w:val="0"/>
+                <w:color w:val="020094"/>
+                <w:sz w:val="15"/>
+              </w:rPr>
+              <w:t>Medias rodantes (Rolling Means) a 3h y 12h de Llegadas-Salidas, con .shift(1) para estricto Zero Data Leakage (t ≤ 0).</w:t>
             </w:r>
           </w:p>
         </w:tc>
@@ -1434,6 +2472,7 @@
           <w:p>
             <w:pPr>
               <w:pageBreakBefore w:val="0"/>
+              <w:spacing w:before="10" w:after="30" w:line="252" w:lineRule="auto"/>
               <w:jc w:val="left"/>
               <w:rPr>
                 <w:rFonts w:ascii="IBM Plex Sans" w:cs="IBM Plex Sans" w:eastAsia="IBM Plex Sans" w:hAnsi="IBM Plex Sans"/>
@@ -1443,6 +2482,65 @@
               <w:rPr>
                 <w:rtl w:val="0"/>
               </w:rPr>
+            </w:r>
+            <w:r>
+              <w:rPr>
+                <w:rFonts w:ascii="IBM Plex Sans" w:hAnsi="IBM Plex Sans" w:cs="IBM Plex Sans"/>
+                <w:b/>
+                <w:color w:val="003399"/>
+                <w:sz w:val="15"/>
+              </w:rPr>
+              <w:t xml:space="preserve">• </w:t>
+            </w:r>
+            <w:r>
+              <w:rPr>
+                <w:rFonts w:ascii="IBM Plex Sans" w:hAnsi="IBM Plex Sans" w:cs="IBM Plex Sans"/>
+                <w:b/>
+                <w:color w:val="111827"/>
+                <w:sz w:val="15"/>
+              </w:rPr>
+              <w:t xml:space="preserve">Criterios de Despliegue: </w:t>
+            </w:r>
+            <w:r>
+              <w:rPr>
+                <w:rFonts w:ascii="IBM Plex Sans" w:hAnsi="IBM Plex Sans" w:cs="IBM Plex Sans"/>
+                <w:b w:val="0"/>
+                <w:color w:val="020094"/>
+                <w:sz w:val="15"/>
+              </w:rPr>
+              <w:t>Macro F1 ≥ 0.35 (logrado: 0.3667 vs baseline 0.3330) y Recall en riesgo ≥ 85% (87.8% desabasto, 90.7% saturación). Latencia &lt; 10 s.</w:t>
+            </w:r>
+          </w:p>
+          <w:p>
+            <w:pPr>
+              <w:spacing w:before="10" w:after="30" w:line="252" w:lineRule="auto"/>
+            </w:pPr>
+            <w:r>
+              <w:rPr>
+                <w:rFonts w:ascii="IBM Plex Sans" w:hAnsi="IBM Plex Sans" w:cs="IBM Plex Sans"/>
+                <w:b/>
+                <w:color w:val="003399"/>
+                <w:sz w:val="15"/>
+              </w:rPr>
+              <w:t xml:space="preserve">• </w:t>
+            </w:r>
+            <w:r>
+              <w:rPr>
+                <w:rFonts w:ascii="IBM Plex Sans" w:hAnsi="IBM Plex Sans" w:cs="IBM Plex Sans"/>
+                <w:b/>
+                <w:color w:val="111827"/>
+                <w:sz w:val="15"/>
+              </w:rPr>
+              <w:t xml:space="preserve">Restricciones de Equidad: </w:t>
+            </w:r>
+            <w:r>
+              <w:rPr>
+                <w:rFonts w:ascii="IBM Plex Sans" w:hAnsi="IBM Plex Sans" w:cs="IBM Plex Sans"/>
+                <w:b w:val="0"/>
+                <w:color w:val="020094"/>
+                <w:sz w:val="15"/>
+              </w:rPr>
+              <w:t>Garantizar atención predictiva equitativa en estaciones periféricas (Tlaquepaque, Zapopan) frente al centro de Guadalajara.</w:t>
             </w:r>
           </w:p>
         </w:tc>
@@ -1508,6 +2606,38 @@
               <w:t xml:space="preserve">How often should they be reviewed?</w:t>
             </w:r>
           </w:p>
+          <w:p>
+            <w:pPr>
+              <w:spacing w:before="10" w:after="30" w:line="252" w:lineRule="auto"/>
+            </w:pPr>
+            <w:r>
+              <w:rPr>
+                <w:rFonts w:ascii="IBM Plex Sans" w:hAnsi="IBM Plex Sans" w:cs="IBM Plex Sans"/>
+                <w:b/>
+                <w:color w:val="003399"/>
+                <w:sz w:val="15"/>
+              </w:rPr>
+              <w:t xml:space="preserve">• </w:t>
+            </w:r>
+            <w:r>
+              <w:rPr>
+                <w:rFonts w:ascii="IBM Plex Sans" w:hAnsi="IBM Plex Sans" w:cs="IBM Plex Sans"/>
+                <w:b/>
+                <w:color w:val="111827"/>
+                <w:sz w:val="15"/>
+              </w:rPr>
+              <w:t xml:space="preserve">KPIs de Negocio: </w:t>
+            </w:r>
+            <w:r>
+              <w:rPr>
+                <w:rFonts w:ascii="IBM Plex Sans" w:hAnsi="IBM Plex Sans" w:cs="IBM Plex Sans"/>
+                <w:b w:val="0"/>
+                <w:color w:val="020094"/>
+                <w:sz w:val="15"/>
+              </w:rPr>
+              <w:t>Reducción ≥ 25% en viajes frustrados; reducción ≥ 30% en horas de estación en estado crítico; ahorro en km y combustible de flota.</w:t>
+            </w:r>
+          </w:p>
         </w:tc>
         <w:tc>
           <w:tcPr>
@@ -1529,7 +2659,7 @@
           <w:p>
             <w:pPr>
               <w:pageBreakBefore w:val="0"/>
-              <w:spacing w:after="200" w:lineRule="auto"/>
+              <w:spacing w:after="30" w:lineRule="auto" w:before="10" w:line="252"/>
               <w:jc w:val="left"/>
               <w:rPr>
                 <w:rFonts w:ascii="IBM Plex Sans" w:cs="IBM Plex Sans" w:eastAsia="IBM Plex Sans" w:hAnsi="IBM Plex Sans"/>
@@ -1542,6 +2672,33 @@
               <w:rPr>
                 <w:rtl w:val="0"/>
               </w:rPr>
+            </w:r>
+            <w:r>
+              <w:rPr>
+                <w:rFonts w:ascii="IBM Plex Sans" w:hAnsi="IBM Plex Sans" w:cs="IBM Plex Sans"/>
+                <w:b/>
+                <w:color w:val="003399"/>
+                <w:sz w:val="15"/>
+              </w:rPr>
+              <w:t xml:space="preserve">• </w:t>
+            </w:r>
+            <w:r>
+              <w:rPr>
+                <w:rFonts w:ascii="IBM Plex Sans" w:hAnsi="IBM Plex Sans" w:cs="IBM Plex Sans"/>
+                <w:b/>
+                <w:color w:val="111827"/>
+                <w:sz w:val="15"/>
+              </w:rPr>
+              <w:t xml:space="preserve">Métricas Técnicas ML: </w:t>
+            </w:r>
+            <w:r>
+              <w:rPr>
+                <w:rFonts w:ascii="IBM Plex Sans" w:hAnsi="IBM Plex Sans" w:cs="IBM Plex Sans"/>
+                <w:b w:val="0"/>
+                <w:color w:val="020094"/>
+                <w:sz w:val="15"/>
+              </w:rPr>
+              <w:t>Macro F1-Score (alerta si &lt; 0.35); Balanced Accuracy (meta ≥ 85%); Recall en Desabasto y Saturación (meta ≥ 85%). Registro en MLflow.</w:t>
             </w:r>
           </w:p>
         </w:tc>
@@ -1622,6 +2779,38 @@
               </w:drawing>
             </w:r>
           </w:p>
+          <w:p>
+            <w:pPr>
+              <w:spacing w:before="10" w:after="30" w:line="252" w:lineRule="auto"/>
+            </w:pPr>
+            <w:r>
+              <w:rPr>
+                <w:rFonts w:ascii="IBM Plex Sans" w:hAnsi="IBM Plex Sans" w:cs="IBM Plex Sans"/>
+                <w:b/>
+                <w:color w:val="003399"/>
+                <w:sz w:val="15"/>
+              </w:rPr>
+              <w:t xml:space="preserve">• </w:t>
+            </w:r>
+            <w:r>
+              <w:rPr>
+                <w:rFonts w:ascii="IBM Plex Sans" w:hAnsi="IBM Plex Sans" w:cs="IBM Plex Sans"/>
+                <w:b/>
+                <w:color w:val="111827"/>
+                <w:sz w:val="15"/>
+              </w:rPr>
+              <w:t xml:space="preserve">Revisión y Data Drift: </w:t>
+            </w:r>
+            <w:r>
+              <w:rPr>
+                <w:rFonts w:ascii="IBM Plex Sans" w:hAnsi="IBM Plex Sans" w:cs="IBM Plex Sans"/>
+                <w:b w:val="0"/>
+                <w:color w:val="020094"/>
+                <w:sz w:val="15"/>
+              </w:rPr>
+              <w:t>Auditoría semanal de métricas; tests Kolmogorov-Smirnov sobre demanda horaria; disparadores de recalibración ante obras o nuevas ciclovías.</w:t>
+            </w:r>
+          </w:p>
         </w:tc>
         <w:tc>
           <w:tcPr>
@@ -1643,7 +2832,7 @@
           <w:p>
             <w:pPr>
               <w:pageBreakBefore w:val="0"/>
-              <w:spacing w:after="200" w:lineRule="auto"/>
+              <w:spacing w:after="30" w:lineRule="auto" w:before="10" w:line="252"/>
               <w:jc w:val="left"/>
               <w:rPr>
                 <w:rFonts w:ascii="IBM Plex Sans" w:cs="IBM Plex Sans" w:eastAsia="IBM Plex Sans" w:hAnsi="IBM Plex Sans"/>
@@ -1655,6 +2844,65 @@
               <w:rPr>
                 <w:rtl w:val="0"/>
               </w:rPr>
+            </w:r>
+            <w:r>
+              <w:rPr>
+                <w:rFonts w:ascii="IBM Plex Sans" w:hAnsi="IBM Plex Sans" w:cs="IBM Plex Sans"/>
+                <w:b/>
+                <w:color w:val="003399"/>
+                <w:sz w:val="15"/>
+              </w:rPr>
+              <w:t xml:space="preserve">• </w:t>
+            </w:r>
+            <w:r>
+              <w:rPr>
+                <w:rFonts w:ascii="IBM Plex Sans" w:hAnsi="IBM Plex Sans" w:cs="IBM Plex Sans"/>
+                <w:b/>
+                <w:color w:val="111827"/>
+                <w:sz w:val="15"/>
+              </w:rPr>
+              <w:t xml:space="preserve">Variables Cíclicas: </w:t>
+            </w:r>
+            <w:r>
+              <w:rPr>
+                <w:rFonts w:ascii="IBM Plex Sans" w:hAnsi="IBM Plex Sans" w:cs="IBM Plex Sans"/>
+                <w:b w:val="0"/>
+                <w:color w:val="020094"/>
+                <w:sz w:val="15"/>
+              </w:rPr>
+              <w:t>Transformación armónica sin/cos de hora del día (2πh/24) y día de la semana (2πdow/7).</w:t>
+            </w:r>
+          </w:p>
+          <w:p>
+            <w:pPr>
+              <w:spacing w:before="10" w:after="30" w:line="252" w:lineRule="auto"/>
+            </w:pPr>
+            <w:r>
+              <w:rPr>
+                <w:rFonts w:ascii="IBM Plex Sans" w:hAnsi="IBM Plex Sans" w:cs="IBM Plex Sans"/>
+                <w:b/>
+                <w:color w:val="003399"/>
+                <w:sz w:val="15"/>
+              </w:rPr>
+              <w:t xml:space="preserve">• </w:t>
+            </w:r>
+            <w:r>
+              <w:rPr>
+                <w:rFonts w:ascii="IBM Plex Sans" w:hAnsi="IBM Plex Sans" w:cs="IBM Plex Sans"/>
+                <w:b/>
+                <w:color w:val="111827"/>
+                <w:sz w:val="15"/>
+              </w:rPr>
+              <w:t xml:space="preserve">Atributos Físicos: </w:t>
+            </w:r>
+            <w:r>
+              <w:rPr>
+                <w:rFonts w:ascii="IBM Plex Sans" w:hAnsi="IBM Plex Sans" w:cs="IBM Plex Sans"/>
+                <w:b w:val="0"/>
+                <w:color w:val="020094"/>
+                <w:sz w:val="15"/>
+              </w:rPr>
+              <w:t>Capacidad instalada de puertos (dpcapacity), latitud y longitud normalizadas.</w:t>
             </w:r>
           </w:p>
         </w:tc>

</xml_diff>